<commit_message>
Additional file 1: title and annotation-rate rounding aligned with manuscript
</commit_message>
<xml_diff>
--- a/manuscript_v2/additional_files/Additional_file_1.docx
+++ b/manuscript_v2/additional_files/Additional_file_1.docx
@@ -12,7 +12,7 @@
           <w:b/>
           <w:sz w:val="32"/>
         </w:rPr>
-        <w:t>Supplementary Method S1</w:t>
+        <w:t>Additional file 1</w:t>
       </w:r>
     </w:p>
     <w:p>
@@ -4516,7 +4516,7 @@
         <w:spacing w:after="120" w:line="259" w:lineRule="auto"/>
       </w:pPr>
       <w:r>
-        <w:t xml:space="preserve">For GHB-732, the layered annotation workflow annotated 29,688 of 35,744 proteins, corresponding to an overall annotation rate of 83.05%. The final fully annotated 585-gene rancidity file used a priority-based function filling strategy: </w:t>
+        <w:t xml:space="preserve">For GHB-732, the layered annotation workflow annotated 29,688 of 35,744 proteins, corresponding to an overall annotation rate of 83.06%. The final fully annotated 585-gene rancidity file used a priority-based function filling strategy: </w:t>
       </w:r>
       <w:proofErr w:type="spellStart"/>
       <w:r>

</xml_diff>

<commit_message>
Update Additional files 1-5 (consistency fixes)
</commit_message>
<xml_diff>
--- a/manuscript_v2/additional_files/Additional_file_1.docx
+++ b/manuscript_v2/additional_files/Additional_file_1.docx
@@ -25,7 +25,7 @@
           <w:i/>
           <w:sz w:val="22"/>
         </w:rPr>
-        <w:t>Detailed bioinformatics workflow for comparative variant-to-function analysis and rancidity candidate prioritization in GHB-732 and GHB-538</w:t>
+        <w:t>Detailed bioinformatics workflow for comparative variant-to-function analysis and candidate gene prioritization</w:t>
       </w:r>
     </w:p>
     <w:p>
@@ -33,7 +33,7 @@
         <w:spacing w:after="120" w:line="259" w:lineRule="auto"/>
       </w:pPr>
       <w:r>
-        <w:t>This supplementary method provides the detailed computational workflow used to process pearl millet whole-genome sequencing data, perform variant discovery and filtering, annotate variant effects, integrate functional annotation evidence, prioritize rancidity-related candidates, compare the two varieties at the allele level with read-level validation, and select a three-gene validation panel. The workflow consolidates the GHB-732 and GHB-538 pipelines, the allele-level comparison and the panel-selection rule.</w:t>
+        <w:t xml:space="preserve">This supplementary method provides the detailed computational workflow used to process pearl millet whole-genome sequencing data, perform variant discovery and filtering, annotate variant effects, integrate functional annotation evidence, prioritize rancidity-related candidate genes, compare the two varieties at the allele level with read-level validation, and select a three-gene validation panel. The workflow consolidates the GHB-732 and GHB-538 pipelines, the allele-level comparison and the panel-selection rule.</w:t>
       </w:r>
     </w:p>
     <w:p>
@@ -50,7 +50,7 @@
         <w:spacing w:after="120" w:line="259" w:lineRule="auto"/>
       </w:pPr>
       <w:r>
-        <w:t>Two contrasting pearl millet genotypes were processed under the same reference-guided framework: GHB-732, the low-rancid genotype, and GHB-538, the high-rancid genotype. Both genotypes were compared against the same ICRISAT/Tift 23D2B1 pearl millet reference genome to maintain a common coordinate system for variant discovery, effect prediction, candidate filtering, and common/unique gene comparison.</w:t>
+        <w:t xml:space="preserve">Two contrasting pearl millet genotypes were processed under the same reference-guided framework: GHB-732, the low-rancidity (LR) genotype, and GHB-538, the high-rancidity (HR) genotype. Both genotypes were compared against the same ICRISAT/Tift 23D2B1 pearl millet reference genome to maintain a common coordinate system for variant discovery, effect prediction, candidate gene filtering, and common/unique gene comparison.</w:t>
       </w:r>
     </w:p>
     <w:tbl>
@@ -465,7 +465,7 @@
               <w:rPr>
                 <w:sz w:val="18"/>
               </w:rPr>
-              <w:t>final GHB-732 and GHB-538 candidate sets</w:t>
+              <w:t xml:space="preserve">final GHB-732 and GHB-538 candidate gene sets</w:t>
             </w:r>
           </w:p>
         </w:tc>
@@ -498,7 +498,7 @@
               <w:rPr>
                 <w:sz w:val="18"/>
               </w:rPr>
-              <w:t>Compare the two candidate lists and merge them into one gene set</w:t>
+              <w:t xml:space="preserve">Compare the two candidate gene lists and merge them into one gene set</w:t>
             </w:r>
           </w:p>
         </w:tc>
@@ -2718,7 +2718,7 @@
               <w:rPr>
                 <w:sz w:val="18"/>
               </w:rPr>
-              <w:t>77.3</w:t>
+              <w:t>77.34</w:t>
             </w:r>
           </w:p>
         </w:tc>
@@ -2737,7 +2737,7 @@
               <w:rPr>
                 <w:sz w:val="18"/>
               </w:rPr>
-              <w:t>Ti/Tv for filtered GHB-732 SNP set</w:t>
+              <w:t>Ti/Tv of filtered SNPs</w:t>
             </w:r>
           </w:p>
         </w:tc>
@@ -2751,7 +2751,7 @@
               <w:rPr>
                 <w:sz w:val="18"/>
               </w:rPr>
-              <w:t>~2.10</w:t>
+              <w:t>2.10</w:t>
             </w:r>
           </w:p>
         </w:tc>
@@ -2762,7 +2762,7 @@
           </w:tcPr>
           <w:p>
             <w:r>
-              <w:t>~2.10</w:t>
+              <w:t>2.14</w:t>
             </w:r>
           </w:p>
         </w:tc>
@@ -4550,7 +4550,7 @@
       </w:pPr>
       <w:r>
         <w:lastRenderedPageBreak/>
-        <w:t>9. Multi-gate rancidity-focused candidate prioritization</w:t>
+        <w:t xml:space="preserve">9. Multi-gate rancidity-focused candidate gene prioritization</w:t>
       </w:r>
     </w:p>
     <w:p>
@@ -4558,15 +4558,15 @@
         <w:spacing w:after="120" w:line="259" w:lineRule="auto"/>
       </w:pPr>
       <w:r>
-        <w:t xml:space="preserve">Genes were considered putative rancidity-associated candidates when their annotation evidence linked them to rancidity-relevant biology. The multi-gate framework was designed to capture lipid hydrolysis, lipid oxidation, oxidative </w:t>
+        <w:t xml:space="preserve">Genes were considered putative rancidity-associated candidate genes when their annotation evidence linked them to rancidity-relevant biology. The multi-gate framework was designed to capture lipid hydrolysis, lipid oxidation, oxidative </w:t>
       </w:r>
       <w:proofErr w:type="spellStart"/>
       <w:r>
-        <w:t>defence</w:t>
+        <w:t xml:space="preserve">defence</w:t>
       </w:r>
       <w:proofErr w:type="spellEnd"/>
       <w:r>
-        <w:t>/detoxification, aldehyde handling and supportive lipid metabolism.</w:t>
+        <w:t xml:space="preserve">/detoxification, aldehyde handling and supportive lipid metabolism.</w:t>
       </w:r>
     </w:p>
     <w:tbl>
@@ -4946,7 +4946,7 @@
               <w:rPr>
                 <w:sz w:val="18"/>
               </w:rPr>
-              <w:t>Protein-architecture support, mainly for domain-rescue candidates</w:t>
+              <w:t xml:space="preserve">Protein-architecture support, mainly for domain-rescue candidate genes</w:t>
             </w:r>
           </w:p>
         </w:tc>
@@ -5187,14 +5187,14 @@
               <w:rPr>
                 <w:sz w:val="18"/>
               </w:rPr>
-              <w:t>Orthology</w:t>
+              <w:t xml:space="preserve">Orthology</w:t>
             </w:r>
             <w:proofErr w:type="spellEnd"/>
             <w:r>
               <w:rPr>
                 <w:sz w:val="18"/>
               </w:rPr>
-              <w:t>-supported candidate retained from the remaining pool when the annotation was biologically meaningful and had at least one relevant evidence gate</w:t>
+              <w:t xml:space="preserve">-supported candidate gene retained from the remaining pool when the annotation was biologically meaningful and had at least one relevant evidence gate</w:t>
             </w:r>
           </w:p>
         </w:tc>
@@ -5255,7 +5255,7 @@
               <w:rPr>
                 <w:sz w:val="18"/>
               </w:rPr>
-              <w:t>Candidate retained from the still-unassigned pool when PFAM/CDD domain evidence strongly supported rancidity-relevant biochemical function</w:t>
+              <w:t xml:space="preserve">Candidate gene retained from the still-unassigned pool when PFAM/CDD domain evidence strongly supported rancidity-relevant biochemical function</w:t>
             </w:r>
           </w:p>
         </w:tc>
@@ -5316,7 +5316,7 @@
               <w:rPr>
                 <w:sz w:val="18"/>
               </w:rPr>
-              <w:t>Final putative rancidity-associated candidate sets</w:t>
+              <w:t xml:space="preserve">Final putative rancidity-associated candidate gene sets</w:t>
             </w:r>
           </w:p>
         </w:tc>
@@ -5365,7 +5365,7 @@
         <w:spacing w:after="120" w:line="259" w:lineRule="auto"/>
       </w:pPr>
       <w:r>
-        <w:t>10. Common and genotype-unique candidate analysis</w:t>
+        <w:t xml:space="preserve">10. Common and genotype-unique candidate gene analysis</w:t>
       </w:r>
     </w:p>
     <w:p>
@@ -5373,7 +5373,7 @@
         <w:spacing w:after="120" w:line="259" w:lineRule="auto"/>
       </w:pPr>
       <w:r>
-        <w:t>Final candidate sets were compared using exact gene-ID membership. Common candidates were defined as the intersection of the GHB-732 and GHB-538 final candidate sets. GHB-732-unique and GHB-538-unique candidates were defined as exact set differences.</w:t>
+        <w:t xml:space="preserve">Final candidate gene sets were compared using exact gene-ID membership. Common candidate genes were defined as the intersection of the GHB-732 and GHB-538 final candidate gene sets. GHB-732-unique and GHB-538-unique candidate genes were defined as exact set differences.</w:t>
       </w:r>
     </w:p>
     <w:tbl>
@@ -5486,7 +5486,7 @@
               <w:rPr>
                 <w:sz w:val="18"/>
               </w:rPr>
-              <w:t>GHB-732 final candidate set ∩ GHB-538 final candidate set</w:t>
+              <w:t xml:space="preserve">GHB-732 final candidate gene set ∩ GHB-538 final candidate gene set</w:t>
             </w:r>
           </w:p>
         </w:tc>
@@ -5514,7 +5514,7 @@
               <w:rPr>
                 <w:sz w:val="18"/>
               </w:rPr>
-              <w:t>Shared candidate core</w:t>
+              <w:t xml:space="preserve">Shared candidate gene core</w:t>
             </w:r>
           </w:p>
         </w:tc>
@@ -5547,7 +5547,7 @@
               <w:rPr>
                 <w:sz w:val="18"/>
               </w:rPr>
-              <w:t>GHB-732 final candidate set minus GHB-538 final candidate set</w:t>
+              <w:t xml:space="preserve">GHB-732 final candidate gene set minus GHB-538 final candidate gene set</w:t>
             </w:r>
           </w:p>
         </w:tc>
@@ -5608,7 +5608,7 @@
               <w:rPr>
                 <w:sz w:val="18"/>
               </w:rPr>
-              <w:t>GHB-538 final candidate set minus GHB-732 final candidate set</w:t>
+              <w:t xml:space="preserve">GHB-538 final candidate gene set minus GHB-732 final candidate gene set</w:t>
             </w:r>
           </w:p>
         </w:tc>
@@ -5669,7 +5669,7 @@
         <w:spacing w:after="120" w:line="259" w:lineRule="auto"/>
       </w:pPr>
       <w:r>
-        <w:t>11.1 Combined gene set. The two final candidate lists were merged into one set of 1,370 genes (323 common, 262 listed only for GHB-732 and 785 listed only for GHB-538). List membership was used only to define this set; differences between the varieties were tested at the allele level, because each list was produced from that variety’s own variant set.</w:t>
+        <w:t xml:space="preserve">11.1 Combined gene set. The two final candidate gene lists were merged into one set of 1,370 genes (323 common, 262 listed only for GHB-732 and 785 listed only for GHB-538). List membership was used only to define this set; differences between the varieties were tested at the allele level, because each list was produced from that variety’s own variant set.</w:t>
       </w:r>
     </w:p>
     <w:p>
@@ -5701,7 +5701,7 @@
         <w:spacing w:after="120" w:line="259" w:lineRule="auto"/>
       </w:pPr>
       <w:r>
-        <w:t>11.5 Candidate scoring and panel selection. Each locus received a priority score of 2 × impact + 2 × rancidity relevance, where impact was that of its most severe validated variety-specific coding allele (HIGH = 4; MODERATE = 3). Loci were eligible when they carried at least one validated variety-specific allele, were not complex loci, and encoded a predicted protein of at least 70% of the length of the best Swiss-Prot hit. The highest-scoring eligible locus in each enzyme family was selected, with ties resolved by (i) more validated variety-specific alleles, (ii) an ortholog with documented seed-storage-lipid function and (iii) a higher allele fraction of the scoring allele in the variety’s own reads. Of 184 scored loci, 34 were eligible, and SDP1 (Pgl_GLEAN_10017888), MAGL (Pgl_GLEAN_10036216) and a PER52-like class III peroxidase (Pgl_GLEAN_10033116) were selected. Scores were used only for prioritization, not as estimates of causal effect.</w:t>
+        <w:t xml:space="preserve">11.5 Candidate gene scoring and panel selection. Each locus received a priority score of 2 × impact + 2 × rancidity relevance, where impact was that of its most severe validated variety-specific coding allele (HIGH = 4; MODERATE = 3). Loci were eligible when they carried at least one validated variety-specific allele, were not complex loci, and encoded a predicted protein of at least 70% of the length of the best Swiss-Prot hit. The highest-scoring eligible locus in each enzyme family was selected, with ties resolved by (i) more validated variety-specific alleles, (ii) an ortholog with documented seed-storage-lipid function and (iii) a higher allele fraction of the scoring allele in the variety’s own reads. Of 184 scored loci, 34 were eligible, and SDP1 (Pgl_GLEAN_10017888), MAGL (Pgl_GLEAN_10036216) and a PER52-like class III peroxidase (Pgl_GLEAN_10033116) were selected. Scores were used only for prioritization, not as estimates of causal effect.</w:t>
       </w:r>
     </w:p>
     <w:p>
@@ -5743,7 +5743,7 @@
         <w:spacing w:after="120" w:line="259" w:lineRule="auto"/>
       </w:pPr>
       <w:r>
-        <w:t>All candidate-gene assignments are prediction-based and annotation-guided. The workflow identifies validation-ready candidates rather than confirmed causal loci. Functional direction and phenotype contribution require downstream validation, such as PCR/Sanger confirmation of selected variants, flour-stage phenotyping, expression analysis, enzyme assays, lipidomic/metabolomic profiling, association testing across broader germplasm or targeted functional validation.</w:t>
+        <w:t xml:space="preserve">All candidate-gene assignments are prediction-based and annotation-guided. The workflow identifies validation-ready candidate genes rather than confirmed causal loci. Functional direction and phenotype contribution require downstream validation, such as PCR/Sanger confirmation of selected variants, flour-stage phenotyping, expression analysis, enzyme assays, lipidomic/metabolomic profiling, association testing across broader germplasm or targeted functional validation.</w:t>
       </w:r>
     </w:p>
     <w:sectPr>

</xml_diff>